<commit_message>
docs: kernel RBF e protocolo oficial documentados (limitações 1 e 15)
</commit_message>
<xml_diff>
--- a/docs/monografia/TC2_EDUARDO_ZANELLA.docx
+++ b/docs/monografia/TC2_EDUARDO_ZANELLA.docx
@@ -9789,7 +9789,7 @@
           <w:highlight w:val="yellow"/>
           <w:lang w:val="pt-BR"/>
         </w:rPr>
-        <w:t xml:space="preserve">ASVspoof 2021 LA; universo fase == 'eval' (148.176 áudios; 14.816 bonafide × 133.360 spoof, 9,0:1); por que progress e hidden foram excluídos; por que o 2021 LA não tem treino/dev próprios e isso obrigou o split interno; composição por codec (57,9% banda estreita) e por ataque.</w:t>
+        <w:t xml:space="preserve">ASVspoof 2021 LA; universo fase == 'eval' (148.176 áudios; 14.816 bonafide × 133.360 spoof, 9,0:1); por que progress e hidden foram excluídos; por que o 2021 LA não tem treino/dev próprios e isso obrigou o split interno; por que não se seguiu o protocolo oficial do desafio (treino no ASVspoof 2019 LA) — justificar pelo desenho, sem inventar motivo histórico (README §Dataset); composição por codec (57,9% banda estreita) e por ataque.</w:t>
       </w:r>
     </w:p>
     <w:p>
@@ -10545,7 +10545,7 @@
           <w:highlight w:val="yellow"/>
           <w:lang w:val="pt-BR"/>
         </w:rPr>
-        <w:t xml:space="preserve">RF: Random Search, 30 iterações, 5-fold, critério EER, com min_samples_leaf 5–20 e class_weight obrigatórios. SVM: kernel RBF, Random Search de 30 iterações sobre C, gamma e class_weight, com StandardScaler dentro do Pipeline. CNN: grade curta de 6 configurações em duas fases (2 arquiteturas × dropout 0 / 0,3 com lr = 1e-3; depois as 2 arquiteturas com lr = 3e-4 no dropout vencedor), Adam, batch 128, paciência 8, teto de 60 épocas, no split 27k/3k, escolhida por f1_macro nos 3k; Random Search descartado pela regra de escopo (12 a 18 min por configuração); refit por nº fixo de épocas.</w:t>
+        <w:t xml:space="preserve">RF: Random Search, 30 iterações, 5-fold, critério EER, com min_samples_leaf 5–20 e class_weight obrigatórios. SVM: kernel RBF fixo, sem busca de kernel (NOTA_RF_VS_SVM.md §4; limitação 15), Random Search de 30 iterações sobre C, gamma e class_weight, com StandardScaler dentro do Pipeline. CNN: grade curta de 6 configurações em duas fases (2 arquiteturas × dropout 0 / 0,3 com lr = 1e-3; depois as 2 arquiteturas com lr = 3e-4 no dropout vencedor), Adam, batch 128, paciência 8, teto de 60 épocas, no split 27k/3k, escolhida por f1_macro nos 3k; Random Search descartado pela regra de escopo (12 a 18 min por configuração); refit por nº fixo de épocas.</w:t>
       </w:r>
     </w:p>
     <w:p>
@@ -12525,7 +12525,7 @@
           <w:highlight w:val="yellow"/>
           <w:lang w:val="pt-BR"/>
         </w:rPr>
-        <w:t xml:space="preserve">Eduardo, a partir da lista de 14 do B6 (e das que aparecerem). Nenhuma omitida. A limitação 9 (CNN com semente única) é definitiva: o orientador encerrou os experimentos em 24/09.</w:t>
+        <w:t xml:space="preserve">Eduardo, a partir da lista de 15 do B6 (e das que aparecerem). Nenhuma omitida. A limitação 9 (CNN com semente única) é definitiva: o orientador encerrou os experimentos em 24/09.</w:t>
       </w:r>
     </w:p>
     <w:p>
@@ -13769,7 +13769,7 @@
           <w:sz w:val="20"/>
           <w:szCs w:val="20"/>
         </w:rPr>
-        <w:t xml:space="preserve">Executado: só a partição eval do ASVspoof 2021 LA (148.176 áudios), porque o 2021 LA não tem treino e desenvolvimento próprios; progress e hidden foram excluídos (o hidden tem silêncio pré-cortado na origem). O 70/15/15 é um split interno desse universo. Fontes: config.yaml → dataset:; README §Universo.</w:t>
+        <w:t xml:space="preserve">Executado: só a partição eval do ASVspoof 2021 LA (148.176 áudios), porque o 2021 LA não tem treino e desenvolvimento próprios; progress e hidden foram excluídos (o hidden tem silêncio pré-cortado na origem). O 70/15/15 é um split interno desse universo. ATENÇÃO (25/09): o protocolo oficial do desafio treina no ASVspoof 2019 LA e avalia no 2021 LA; este trabalho não o seguiu, e o motivo da época não foi registrado. Não invente motivo: justifique pelo desenho (comparar famílias no mesmo ambiente, com as mesmas condições de ataque e codec no treino dos três) e declare o preço (limitação 1). Texto pronto: README §Dataset e APENDICE_B §13. Fontes: config.yaml → dataset:; README §Universo.</w:t>
       </w:r>
     </w:p>
   </w:comment>
@@ -13805,7 +13805,7 @@
           <w:sz w:val="20"/>
           <w:szCs w:val="20"/>
         </w:rPr>
-        <w:t xml:space="preserve">Executado: Random Search de 30 iterações, 5-fold e critério EER para RF e SVM. Duas divergências a declarar no Cap. 3.7 — são perguntas certas de banca: (a) o kernel do SVM ficou fixo em RBF, e o TC I promete buscar o tipo de kernel. Justificativa possível: com gamma pequeno o RBF se aproxima do comportamento do kernel linear (KEERTHI; LIN, 2003), e o espaço buscou gamma em loguniform(1e-4; 1e-1); o RBF é a escolha inicial recomendada (HSU; CHANG; LIN, 2003). (b) A CNN não teve Random Search: foi uma grade curta de 6 configurações em duas fases (arquitetura × dropout com lr = 1e-3; depois lr = 3e-4 no dropout vencedor), porque cada treino custou de 12 a 18 min de GPU — a regra de escopo manda reduzir o espaço de busca (busca_cnn.csv; B4.5). Taxa de aprendizado, filtros e dropout foram explorados, mas em grade.</w:t>
+        <w:t xml:space="preserve">Executado: Random Search de 30 iterações, 5-fold e critério EER para RF e SVM. Duas divergências a declarar no Cap. 3.7 — são perguntas certas de banca: (a) o kernel do SVM ficou fixo em RBF, sem busca de kernel, e o TC I promete buscar o tipo. Motivo documentado em 25/09 (NOTA_RF_VS_SVM.md §4), declarado como a posteriori: o RBF é a escolha inicial recomendada (HSU; CHANG; LIN, 2003) e contém o linear como caso limite (KEERTHI; LIN, 2003); os 7 candidatos da busca com gamma ≤ 1e-3, regime quase linear, tiveram EER de CV de 0,187 a 0,290, contra 0,153 do melhor. Não alegar custo (a busca levou 392 s). Limitação 15. (b) A CNN não teve Random Search: foi uma grade curta de 6 configurações em duas fases (arquitetura × dropout com lr = 1e-3; depois lr = 3e-4 no dropout vencedor), porque cada treino custou de 12 a 18 min de GPU — a regra de escopo manda reduzir o espaço de busca (busca_cnn.csv; B4.5). Taxa de aprendizado, filtros e dropout foram explorados, mas em grade.</w:t>
       </w:r>
     </w:p>
   </w:comment>

</xml_diff>